<commit_message>
Apply 지도학회지 citation format: fix in-text citations, add reference list, remove EndNote
- In-text: & → and for foreign 2-authors, 이희연·이다예·유재성 → 이희연 등 (3+), add commas in parenthetical (Tiebout, 1956) etc.
- Add full reference list with italic journal names (⚠️ markers for [SW] entries)
- Figure/Table captions → 그림/표 per 편집규정
- Section headings: H1/H2 → 연구 질문
- Task directive: replace EndNote with 지도학회지 direct citation format guide
- Guide MD: add 지도학회지 제13조 citation format reference

Co-Authored-By: Claude Sonnet 4.6 <noreply@anthropic.com>
</commit_message>
<xml_diff>
--- a/RSG_final/공동작업_업무지시서.docx
+++ b/RSG_final/공동작업_업무지시서.docx
@@ -574,7 +574,7 @@
           <w:i w:val="0"/>
           <w:sz w:val="20"/>
         </w:rPr>
-        <w:t>참고문헌은 처음부터 EndNote로 삽입 — 나중에 수동 정리하지 않아도 되도록</w:t>
+        <w:t>인용 시 처음부터 지도학회지 편집규정 형식으로 직접 작성 — 본문 인용 달면서 동시에 맨 뒤 참고문헌 목록에도 추가</w:t>
       </w:r>
     </w:p>
     <w:p>
@@ -796,7 +796,58 @@
           <w:i w:val="0"/>
           <w:sz w:val="20"/>
         </w:rPr>
-        <w:t>EndNote 라이브러리로 전체 참고문헌 등록 후 지도학회지 스타일로 출력</w:t>
+        <w:t>지도학회지 편집규정 참고문헌 형식으로 직접 작성</w:t>
+      </w:r>
+    </w:p>
+    <w:p>
+      <w:pPr>
+        <w:pStyle w:val="ListBullet2"/>
+        <w:spacing w:before="20" w:after="40" w:line="312" w:lineRule="auto"/>
+        <w:ind w:left="576"/>
+      </w:pPr>
+      <w:r>
+        <w:rPr>
+          <w:rFonts w:ascii="맑은 고딕" w:hAnsi="맑은 고딕"/>
+          <w:b w:val="0"/>
+          <w:i w:val="0"/>
+          <w:color w:val="333333"/>
+          <w:sz w:val="19"/>
+        </w:rPr>
+        <w:t>국내: 저자, 연도, 제목, 저널명, 권(호), 페이지.</w:t>
+      </w:r>
+    </w:p>
+    <w:p>
+      <w:pPr>
+        <w:pStyle w:val="ListBullet2"/>
+        <w:spacing w:before="20" w:after="40" w:line="312" w:lineRule="auto"/>
+        <w:ind w:left="576"/>
+      </w:pPr>
+      <w:r>
+        <w:rPr>
+          <w:rFonts w:ascii="맑은 고딕" w:hAnsi="맑은 고딕"/>
+          <w:b w:val="0"/>
+          <w:i w:val="0"/>
+          <w:color w:val="333333"/>
+          <w:sz w:val="19"/>
+        </w:rPr>
+        <w:t>외국어: 저자, 연도, 제목, 저널명(이탤릭), 권(호), 페이지. DOI.</w:t>
+      </w:r>
+    </w:p>
+    <w:p>
+      <w:pPr>
+        <w:pStyle w:val="ListBullet2"/>
+        <w:spacing w:before="20" w:after="40" w:line="312" w:lineRule="auto"/>
+        <w:ind w:left="576"/>
+      </w:pPr>
+      <w:r>
+        <w:rPr>
+          <w:rFonts w:ascii="맑은 고딕" w:hAnsi="맑은 고딕"/>
+          <w:b w:val="0"/>
+          <w:i w:val="0"/>
+          <w:color w:val="333333"/>
+          <w:sz w:val="19"/>
+        </w:rPr>
+        <w:t>배열 순서: 국내 문헌 → 외국어 문헌 / 각각 저자명 자모음·알파벳 순</w:t>
       </w:r>
     </w:p>
     <w:p>
@@ -812,7 +863,7 @@
           <w:i w:val="0"/>
           <w:sz w:val="20"/>
         </w:rPr>
-        <w:t>참고문헌 파일(Word) 별도 전달 — 서기에게 목요일까지</w:t>
+        <w:t>정리된 참고문헌 목록 Word 파일로 서기에게 목요일까지 전달</w:t>
       </w:r>
     </w:p>
     <w:p>
@@ -985,7 +1036,7 @@
           <w:color w:val="333333"/>
           <w:sz w:val="19"/>
         </w:rPr>
-        <w:t>참고문헌 EndNote 출력본과 본문 인용 번호 최종 대조</w:t>
+        <w:t>참고문헌 목록과 본문 인용 표기 일치 여부 최종 대조 (누락·중복 확인)</w:t>
       </w:r>
     </w:p>
     <w:p>
@@ -1437,7 +1488,24 @@
           <w:color w:val="1F3D6E"/>
           <w:sz w:val="21"/>
         </w:rPr>
-        <w:t>⑤ 참고문헌 EndNote 사용 필수</w:t>
+        <w:t>⑤ 참고문헌 — 지도학회지 편집규정 형식으로 직접 작성</w:t>
+      </w:r>
+    </w:p>
+    <w:p>
+      <w:pPr>
+        <w:spacing w:before="60" w:after="60" w:line="324" w:lineRule="auto"/>
+        <w:ind w:left="216"/>
+        <w:shd w:val="clear" w:color="auto" w:fill="EBF5EB"/>
+      </w:pPr>
+      <w:r>
+        <w:rPr>
+          <w:rFonts w:ascii="맑은 고딕" w:hAnsi="맑은 고딕"/>
+          <w:b w:val="0"/>
+          <w:i w:val="0"/>
+          <w:color w:val="1A4020"/>
+          <w:sz w:val="19"/>
+        </w:rPr>
+        <w:t>EndNote 사용 없이 지도학회지 편집규정(제13조)에 따라 직접 작성합니다. 본문에 인용 표기하면서 동시에 맨 뒤 참고문헌 단락에 해당 문헌을 추가해 주세요.</w:t>
       </w:r>
     </w:p>
     <w:p>
@@ -1453,7 +1521,92 @@
           <w:i w:val="0"/>
           <w:sz w:val="20"/>
         </w:rPr>
-        <w:t>모든 인용은 처음부터 EndNote로 삽입 — 수동 입력 금지</w:t>
+        <w:t>본문 인용 형식</w:t>
+      </w:r>
+    </w:p>
+    <w:p>
+      <w:pPr>
+        <w:pStyle w:val="ListBullet2"/>
+        <w:spacing w:before="20" w:after="40" w:line="312" w:lineRule="auto"/>
+        <w:ind w:left="576"/>
+      </w:pPr>
+      <w:r>
+        <w:rPr>
+          <w:rFonts w:ascii="맑은 고딕" w:hAnsi="맑은 고딕"/>
+          <w:b w:val="0"/>
+          <w:i w:val="0"/>
+          <w:color w:val="333333"/>
+          <w:sz w:val="19"/>
+        </w:rPr>
+        <w:t>서술형: 저자(연도) → 예: Feitosa(2007)는…</w:t>
+      </w:r>
+    </w:p>
+    <w:p>
+      <w:pPr>
+        <w:pStyle w:val="ListBullet2"/>
+        <w:spacing w:before="20" w:after="40" w:line="312" w:lineRule="auto"/>
+        <w:ind w:left="576"/>
+      </w:pPr>
+      <w:r>
+        <w:rPr>
+          <w:rFonts w:ascii="맑은 고딕" w:hAnsi="맑은 고딕"/>
+          <w:b w:val="0"/>
+          <w:i w:val="0"/>
+          <w:color w:val="333333"/>
+          <w:sz w:val="19"/>
+        </w:rPr>
+        <w:t>괄호형: (저자, 연도) → 예: …로 나타났다(Bell, 1954).</w:t>
+      </w:r>
+    </w:p>
+    <w:p>
+      <w:pPr>
+        <w:pStyle w:val="ListBullet2"/>
+        <w:spacing w:before="20" w:after="40" w:line="312" w:lineRule="auto"/>
+        <w:ind w:left="576"/>
+      </w:pPr>
+      <w:r>
+        <w:rPr>
+          <w:rFonts w:ascii="맑은 고딕" w:hAnsi="맑은 고딕"/>
+          <w:b w:val="0"/>
+          <w:i w:val="0"/>
+          <w:color w:val="333333"/>
+          <w:sz w:val="19"/>
+        </w:rPr>
+        <w:t>2인 저자: 외국어 and, 한국어 · → Reardon and Bischoff(2011) / 안용한·김영호(2023)</w:t>
+      </w:r>
+    </w:p>
+    <w:p>
+      <w:pPr>
+        <w:pStyle w:val="ListBullet2"/>
+        <w:spacing w:before="20" w:after="40" w:line="312" w:lineRule="auto"/>
+        <w:ind w:left="576"/>
+      </w:pPr>
+      <w:r>
+        <w:rPr>
+          <w:rFonts w:ascii="맑은 고딕" w:hAnsi="맑은 고딕"/>
+          <w:b w:val="0"/>
+          <w:i w:val="0"/>
+          <w:color w:val="333333"/>
+          <w:sz w:val="19"/>
+        </w:rPr>
+        <w:t>3인 이상: 외국어 et al., 한국어 등 → Kim et al.(2021) / 이희연 등(2015)</w:t>
+      </w:r>
+    </w:p>
+    <w:p>
+      <w:pPr>
+        <w:pStyle w:val="ListBullet2"/>
+        <w:spacing w:before="20" w:after="40" w:line="312" w:lineRule="auto"/>
+        <w:ind w:left="576"/>
+      </w:pPr>
+      <w:r>
+        <w:rPr>
+          <w:rFonts w:ascii="맑은 고딕" w:hAnsi="맑은 고딕"/>
+          <w:b w:val="0"/>
+          <w:i w:val="0"/>
+          <w:color w:val="333333"/>
+          <w:sz w:val="19"/>
+        </w:rPr>
+        <w:t>여러 문헌 괄호 안: 세미콜론(;)으로 분리, 국문 먼저 → (이희연 등, 2015; Bell, 1954)</w:t>
       </w:r>
     </w:p>
     <w:p>
@@ -1469,7 +1622,58 @@
           <w:i w:val="0"/>
           <w:sz w:val="20"/>
         </w:rPr>
-        <w:t>스타일: 지도학회지 인용 스타일 적용 (승원이 라이브러리 공유 예정)</w:t>
+        <w:t>참고문헌 목록 형식 (맨 뒤에 직접 추가)</w:t>
+      </w:r>
+    </w:p>
+    <w:p>
+      <w:pPr>
+        <w:pStyle w:val="ListBullet2"/>
+        <w:spacing w:before="20" w:after="40" w:line="312" w:lineRule="auto"/>
+        <w:ind w:left="576"/>
+      </w:pPr>
+      <w:r>
+        <w:rPr>
+          <w:rFonts w:ascii="맑은 고딕" w:hAnsi="맑은 고딕"/>
+          <w:b w:val="0"/>
+          <w:i w:val="0"/>
+          <w:color w:val="333333"/>
+          <w:sz w:val="19"/>
+        </w:rPr>
+        <w:t>국내: 안용한·김영호, 2023, "제목," 저널명, 권(호), 시작-끝쪽.</w:t>
+      </w:r>
+    </w:p>
+    <w:p>
+      <w:pPr>
+        <w:pStyle w:val="ListBullet2"/>
+        <w:spacing w:before="20" w:after="40" w:line="312" w:lineRule="auto"/>
+        <w:ind w:left="576"/>
+      </w:pPr>
+      <w:r>
+        <w:rPr>
+          <w:rFonts w:ascii="맑은 고딕" w:hAnsi="맑은 고딕"/>
+          <w:b w:val="0"/>
+          <w:i w:val="0"/>
+          <w:color w:val="333333"/>
+          <w:sz w:val="19"/>
+        </w:rPr>
+        <w:t>외국어: Duncan, O.D. and Duncan, B., 1955, Title, Journal Name(이탤릭), 권(호), 쪽.</w:t>
+      </w:r>
+    </w:p>
+    <w:p>
+      <w:pPr>
+        <w:pStyle w:val="ListBullet2"/>
+        <w:spacing w:before="20" w:after="40" w:line="312" w:lineRule="auto"/>
+        <w:ind w:left="576"/>
+      </w:pPr>
+      <w:r>
+        <w:rPr>
+          <w:rFonts w:ascii="맑은 고딕" w:hAnsi="맑은 고딕"/>
+          <w:b w:val="0"/>
+          <w:i w:val="0"/>
+          <w:color w:val="333333"/>
+          <w:sz w:val="19"/>
+        </w:rPr>
+        <w:t>배열: 국내 문헌 먼저(자모음 순) → 외국어 문헌(알파벳 순)</w:t>
       </w:r>
     </w:p>
     <w:p>
@@ -1485,7 +1689,7 @@
           <w:i w:val="0"/>
           <w:sz w:val="20"/>
         </w:rPr>
-        <w:t>나중에 수동 정리하는 것이 훨씬 번거로우니 처음부터 필수</w:t>
+        <w:t>인용하면서 바로 목록에 추가하는 습관 — 나중에 모아서 정리하면 누락 발생</w:t>
       </w:r>
     </w:p>
     <w:p>

</xml_diff>